<commit_message>
Leer README.md, añadí guión vídeo, leer también. Queda faltando finalizar el documento de la sustentación
</commit_message>
<xml_diff>
--- a/Actividades/Actividad 2/Actividad_2.2_Bitacora_Decisiones_IA.docx
+++ b/Actividades/Actividad 2/Actividad_2.2_Bitacora_Decisiones_IA.docx
@@ -2210,6 +2210,274 @@
           </w:p>
         </w:tc>
       </w:tr>
+      <w:tr>
+        <w:tc>
+          <w:tcPr>
+            <w:tcW w:type="dxa" w:w="737"/>
+          </w:tcPr>
+          <w:p>
+            <w:r>
+              <w:rPr>
+                <w:sz w:val="18"/>
+              </w:rPr>
+              <w:t>B-11</w:t>
+            </w:r>
+          </w:p>
+        </w:tc>
+        <w:tc>
+          <w:tcPr>
+            <w:tcW w:type="dxa" w:w="2438"/>
+          </w:tcPr>
+          <w:p>
+            <w:r>
+              <w:rPr>
+                <w:sz w:val="18"/>
+              </w:rPr>
+              <w:t>Evaluar Mediator para la coordinación entre ventas, clientes, productos y movimientos (P-03 / P-04 / P-05).</w:t>
+            </w:r>
+          </w:p>
+        </w:tc>
+        <w:tc>
+          <w:tcPr>
+            <w:tcW w:type="dxa" w:w="2438"/>
+          </w:tcPr>
+          <w:p>
+            <w:r>
+              <w:rPr>
+                <w:sz w:val="18"/>
+              </w:rPr>
+              <w:t>Descartar: alto riesgo de convertirse en una God Class; la coordinación requerida puede resolverse con una Facade limitada + Observer en vez de añadir una dependencia central adicional.</w:t>
+            </w:r>
+          </w:p>
+        </w:tc>
+        <w:tc>
+          <w:tcPr>
+            <w:tcW w:type="dxa" w:w="1134"/>
+          </w:tcPr>
+          <w:p>
+            <w:r>
+              <w:rPr>
+                <w:sz w:val="18"/>
+              </w:rPr>
+              <w:t>Aceptamos</w:t>
+            </w:r>
+          </w:p>
+        </w:tc>
+        <w:tc>
+          <w:tcPr>
+            <w:tcW w:type="dxa" w:w="2608"/>
+          </w:tcPr>
+          <w:p>
+            <w:r>
+              <w:rPr>
+                <w:sz w:val="18"/>
+              </w:rPr>
+              <w:t>Consistente con el límite ya declarado para Facade (B-06): evita que dos patrones compitan por el mismo rol de coordinador. Tabla Actividad 2, fila Mediator. [Restaurado 2026-09-04: esta fila se había perdido en una edición posterior del archivo hecha fuera de esta sesión.]</w:t>
+            </w:r>
+          </w:p>
+        </w:tc>
+      </w:tr>
+      <w:tr>
+        <w:tc>
+          <w:tcPr>
+            <w:tcW w:type="dxa" w:w="737"/>
+          </w:tcPr>
+          <w:p>
+            <w:r>
+              <w:rPr>
+                <w:sz w:val="18"/>
+              </w:rPr>
+              <w:t>B-12</w:t>
+            </w:r>
+          </w:p>
+        </w:tc>
+        <w:tc>
+          <w:tcPr>
+            <w:tcW w:type="dxa" w:w="2438"/>
+          </w:tcPr>
+          <w:p>
+            <w:r>
+              <w:rPr>
+                <w:sz w:val="18"/>
+              </w:rPr>
+              <w:t>Dado que Reto 1 dejó infraestructura para las 3 solicitudes del Anexo B pero solo SC-2 quedó operativa (SC-1 y SC-3 son, en la práctica, P-01 y P-02), el equipo pidió a la IA recomendar cuál de SC-1 o SC-3 reclamar formalmente como la solicitud de cambio de Reto 2.</w:t>
+            </w:r>
+          </w:p>
+        </w:tc>
+        <w:tc>
+          <w:tcPr>
+            <w:tcW w:type="dxa" w:w="2438"/>
+          </w:tcPr>
+          <w:p>
+            <w:r>
+              <w:rPr>
+                <w:sz w:val="18"/>
+              </w:rPr>
+              <w:t>Recomendar SC-3 (convenios/descuentos) sobre SC-1 (cosméticos/alimentos): menor riesgo, no exige cambiar el formato de productos.txt, y la infraestructura de Strategy ya estaba conectada en un 90%.</w:t>
+            </w:r>
+          </w:p>
+        </w:tc>
+        <w:tc>
+          <w:tcPr>
+            <w:tcW w:type="dxa" w:w="1134"/>
+          </w:tcPr>
+          <w:p>
+            <w:r>
+              <w:rPr>
+                <w:sz w:val="18"/>
+              </w:rPr>
+              <w:t>Aceptamos</w:t>
+            </w:r>
+          </w:p>
+        </w:tc>
+        <w:tc>
+          <w:tcPr>
+            <w:tcW w:type="dxa" w:w="2608"/>
+          </w:tcPr>
+          <w:p>
+            <w:r>
+              <w:rPr>
+                <w:sz w:val="18"/>
+              </w:rPr>
+              <w:t>El equipo eligió explícitamente SC-3 entre las opciones presentadas (SC-1, SC-3, o ambas). Ver PROJECT_STATE.md, sección "Implementación de código".</w:t>
+            </w:r>
+          </w:p>
+        </w:tc>
+      </w:tr>
+      <w:tr>
+        <w:tc>
+          <w:tcPr>
+            <w:tcW w:type="dxa" w:w="737"/>
+          </w:tcPr>
+          <w:p>
+            <w:r>
+              <w:rPr>
+                <w:sz w:val="18"/>
+              </w:rPr>
+              <w:t>B-13</w:t>
+            </w:r>
+          </w:p>
+        </w:tc>
+        <w:tc>
+          <w:tcPr>
+            <w:tcW w:type="dxa" w:w="2438"/>
+          </w:tcPr>
+          <w:p>
+            <w:r>
+              <w:rPr>
+                <w:sz w:val="18"/>
+              </w:rPr>
+              <w:t>Al activar Strategy con datos reales (caso C-11: Carlos, cliente con convenio del 15%, compra Omeprazol), la primera corrida del descuento dio un resultado absurdo (-$420.000 en vez de $25.500).</w:t>
+            </w:r>
+          </w:p>
+        </w:tc>
+        <w:tc>
+          <w:tcPr>
+            <w:tcW w:type="dxa" w:w="2438"/>
+          </w:tcPr>
+          <w:p>
+            <w:r>
+              <w:rPr>
+                <w:sz w:val="18"/>
+              </w:rPr>
+              <w:t>Diagnóstico propio de la IA, no fue una pregunta del equipo: decimal.Parse sin especificar cultura, en la cultura del sistema (es-CO), interpreta "0.15" como 15 en vez de 0,15.</w:t>
+            </w:r>
+          </w:p>
+        </w:tc>
+        <w:tc>
+          <w:tcPr>
+            <w:tcW w:type="dxa" w:w="1134"/>
+          </w:tcPr>
+          <w:p>
+            <w:r>
+              <w:rPr>
+                <w:sz w:val="18"/>
+              </w:rPr>
+              <w:t>Corregimos</w:t>
+            </w:r>
+          </w:p>
+        </w:tc>
+        <w:tc>
+          <w:tcPr>
+            <w:tcW w:type="dxa" w:w="2608"/>
+          </w:tcPr>
+          <w:p>
+            <w:r>
+              <w:rPr>
+                <w:sz w:val="18"/>
+              </w:rPr>
+              <w:t>Corregido con CultureInfo.InvariantCulture en ServicioCliente.Cargar; re-verificado contra los 9 escenarios de Actividad 4.2 sin regresiones. Documentado también como riesgo R-02 en Actividad 5.1, citando este mismo caso como evidencia de que no es hipotético.</w:t>
+            </w:r>
+          </w:p>
+        </w:tc>
+      </w:tr>
+      <w:tr>
+        <w:tc>
+          <w:tcPr>
+            <w:tcW w:type="dxa" w:w="737"/>
+          </w:tcPr>
+          <w:p>
+            <w:r>
+              <w:rPr>
+                <w:sz w:val="18"/>
+              </w:rPr>
+              <w:t>B-14</w:t>
+            </w:r>
+          </w:p>
+        </w:tc>
+        <w:tc>
+          <w:tcPr>
+            <w:tcW w:type="dxa" w:w="2438"/>
+          </w:tcPr>
+          <w:p>
+            <w:r>
+              <w:rPr>
+                <w:sz w:val="18"/>
+              </w:rPr>
+              <w:t>Al documentar R-01 (tasa de descuento fuera de rango) en el registro de riesgos, se evaluó si convenía solo dejarlo documentado o corregirlo en el código de una vez.</w:t>
+            </w:r>
+          </w:p>
+        </w:tc>
+        <w:tc>
+          <w:tcPr>
+            <w:tcW w:type="dxa" w:w="2438"/>
+          </w:tcPr>
+          <w:p>
+            <w:r>
+              <w:rPr>
+                <w:sz w:val="18"/>
+              </w:rPr>
+              <w:t>Agregar una validación de rango [0,1] en ServicioCliente.Cargar antes de asignar el Convenio, en vez de dejar un riesgo conocido sin mitigar.</w:t>
+            </w:r>
+          </w:p>
+        </w:tc>
+        <w:tc>
+          <w:tcPr>
+            <w:tcW w:type="dxa" w:w="1134"/>
+          </w:tcPr>
+          <w:p>
+            <w:r>
+              <w:rPr>
+                <w:sz w:val="18"/>
+              </w:rPr>
+              <w:t>Corregimos</w:t>
+            </w:r>
+          </w:p>
+        </w:tc>
+        <w:tc>
+          <w:tcPr>
+            <w:tcW w:type="dxa" w:w="2608"/>
+          </w:tcPr>
+          <w:p>
+            <w:r>
+              <w:rPr>
+                <w:sz w:val="18"/>
+              </w:rPr>
+              <w:t>Re-verificado contra los 9 escenarios de Actividad 4.2 sin regresiones (ninguno usa una tasa fuera de rango, así que el comportamiento para los datos actuales no cambia). Ver PROJECT_STATE.md.</w:t>
+            </w:r>
+          </w:p>
+        </w:tc>
+      </w:tr>
     </w:tbl>
     <w:p/>
     <w:p>
@@ -2224,6 +2492,48 @@
           <w:lang w:val="es-CO"/>
         </w:rPr>
       </w:pPr>
+    </w:p>
+    <w:p/>
+    <w:p>
+      <w:pPr>
+        <w:pStyle w:val="Heading2"/>
+      </w:pPr>
+      <w:r>
+        <w:t>Notas para el equipo</w:t>
+      </w:r>
+    </w:p>
+    <w:p>
+      <w:pPr>
+        <w:pStyle w:val="ListBullet"/>
+      </w:pPr>
+      <w:r>
+        <w:rPr>
+          <w:sz w:val="20"/>
+        </w:rPr>
+        <w:t>Se registraron 14 decisiones (mínimo exigido: 10). B-01 a B-06, B-10 y B-11 reconstruyen decisiones que ya estaban tomadas en los borradores de Actividad 1 y 2 cuando empezó la primera sesión — revísenlas en persona: necesitan poder defenderlas si un registro sale elegido al azar en la sustentación.</w:t>
+      </w:r>
+    </w:p>
+    <w:p>
+      <w:pPr>
+        <w:pStyle w:val="ListBullet"/>
+      </w:pPr>
+      <w:r>
+        <w:rPr>
+          <w:sz w:val="20"/>
+        </w:rPr>
+        <w:t>B-07, B-08, B-09, B-12, B-13 y B-14 sí ocurrieron dentro de sesiones de trabajo reales y tienen contexto de conversación verificable, incluido un rechazo explícito del equipo (B-08) y un error real que la IA encontró y corrigió en su propio trabajo (B-13) — son el mejor material para "criterio propio frente a la IA" de la sustentación.</w:t>
+      </w:r>
+    </w:p>
+    <w:p>
+      <w:pPr>
+        <w:pStyle w:val="ListBullet"/>
+      </w:pPr>
+      <w:r>
+        <w:rPr>
+          <w:sz w:val="20"/>
+        </w:rPr>
+        <w:t>Nota de auditoría (2026-09-04): la fila B-11 y esta sección de notas se habían perdido en una edición del archivo hecha fuera de las sesiones con Claude (el documento mostraba marcas de edición en Word que esta sesión no genera). Se restauraron ambas al verificar el proyecto completo. Si alguien del equipo edita este archivo directamente en Word, avisar en la próxima sesión para no volver a perder contenido.</w:t>
+      </w:r>
     </w:p>
     <w:sectPr>
       <w:pgSz w:w="12240" w:h="15840"/>

</xml_diff>